<commit_message>
improve DLP descriptive stats documentation
</commit_message>
<xml_diff>
--- a/deped-dlp-descriptive-stats/outputs/descriptive_results_brief.docx
+++ b/deped-dlp-descriptive-stats/outputs/descriptive_results_brief.docx
@@ -8,20 +8,7 @@
         <w:rPr/>
       </w:pPr>
       <w:r>
-        <w:rPr>
-          <w:b w:val="1"/>
-          <w:bCs w:val="1"/>
-          <w:color w:val="77c181"/>
-          <w:sz w:val="44"/>
-          <w:szCs w:val="44"/>
-          <w:rtl w:val="0"/>
-        </w:rPr>
-        <w:t xml:space="preserve">DLP Pilot Descriptive Results</w:t>
-      </w:r>
-      <w:r>
-        <w:rPr>
-          <w:rtl w:val="0"/>
-        </w:rPr>
+        <w:t>DLP Pilot Descriptive Results</w:t>
       </w:r>
     </w:p>
     <w:p>
@@ -51,107 +38,31 @@
         </w:rPr>
       </w:pPr>
       <w:r>
-        <w:rPr>
-          <w:color w:val="77c181"/>
-          <w:rtl w:val="0"/>
-        </w:rPr>
-        <w:t xml:space="preserve">Overview</w:t>
-      </w:r>
-    </w:p>
-    <w:p>
-      <w:pPr>
-        <w:rPr>
-          <w:rFonts w:ascii="Arial" w:cs="Arial" w:eastAsia="Arial" w:hAnsi="Arial"/>
-          <w:sz w:val="22"/>
-          <w:szCs w:val="22"/>
-        </w:rPr>
-      </w:pPr>
-      <w:r>
-        <w:rPr>
-          <w:rFonts w:ascii="Arial" w:cs="Arial" w:eastAsia="Arial" w:hAnsi="Arial"/>
-          <w:sz w:val="22"/>
-          <w:szCs w:val="22"/>
-          <w:rtl w:val="0"/>
-        </w:rPr>
-        <w:t xml:space="preserve">Developed by Dr. Christopher Bernido and Dr. Maria Victoria Carpio-Bernido, Ramon Magsaysay Awardee Theoretical Physicists, the Dynamic Learning Program (DLP) is an activity-based curriculum fostering independent learning by having students read, write, and complete exercises before lessons are formally discussed in the classroom. The Philippines Department of Education (DepEd) recognized DLP as one of its alternative learning modalities (ADMs) to address key challenges in basic education such as overcrowded classrooms, multiple shifts, and class disruptions caused by emergency situations (e.g., disaster, conflict). </w:t>
-      </w:r>
-    </w:p>
-    <w:p>
-      <w:pPr>
-        <w:rPr>
-          <w:rFonts w:ascii="Arial" w:cs="Arial" w:eastAsia="Arial" w:hAnsi="Arial"/>
-          <w:sz w:val="22"/>
-          <w:szCs w:val="22"/>
-        </w:rPr>
-      </w:pPr>
-      <w:r>
-        <w:rPr>
-          <w:rFonts w:ascii="Arial" w:cs="Arial" w:eastAsia="Arial" w:hAnsi="Arial"/>
-          <w:sz w:val="22"/>
-          <w:szCs w:val="22"/>
-          <w:rtl w:val="0"/>
-        </w:rPr>
-        <w:t xml:space="preserve">To evaluate program effectiveness, the Lab—together with the Principal Investigators—randomly selected 100 schools for each of three implementation contexts: a </w:t>
-      </w:r>
-      <w:r>
-        <w:rPr>
-          <w:rFonts w:ascii="Arial" w:cs="Arial" w:eastAsia="Arial" w:hAnsi="Arial"/>
-          <w:b w:val="1"/>
-          <w:bCs w:val="1"/>
-          <w:sz w:val="22"/>
-          <w:szCs w:val="22"/>
-          <w:rtl w:val="0"/>
-        </w:rPr>
-        <w:t xml:space="preserve">mainstream model</w:t>
-      </w:r>
-      <w:r>
-        <w:rPr>
-          <w:rFonts w:ascii="Arial" w:cs="Arial" w:eastAsia="Arial" w:hAnsi="Arial"/>
-          <w:sz w:val="22"/>
-          <w:szCs w:val="22"/>
-          <w:rtl w:val="0"/>
-        </w:rPr>
-        <w:t xml:space="preserve"> for overcrowded classrooms, a </w:t>
-      </w:r>
-      <w:r>
-        <w:rPr>
-          <w:rFonts w:ascii="Arial" w:cs="Arial" w:eastAsia="Arial" w:hAnsi="Arial"/>
-          <w:b w:val="1"/>
-          <w:bCs w:val="1"/>
-          <w:sz w:val="22"/>
-          <w:szCs w:val="22"/>
-          <w:rtl w:val="0"/>
-        </w:rPr>
-        <w:t xml:space="preserve">shifting model </w:t>
-      </w:r>
-      <w:r>
-        <w:rPr>
-          <w:rFonts w:ascii="Arial" w:cs="Arial" w:eastAsia="Arial" w:hAnsi="Arial"/>
-          <w:sz w:val="22"/>
-          <w:szCs w:val="22"/>
-          <w:rtl w:val="0"/>
-        </w:rPr>
-        <w:t xml:space="preserve">for schools operating multiple shifts, and an </w:t>
-      </w:r>
-      <w:r>
-        <w:rPr>
-          <w:rFonts w:ascii="Arial" w:cs="Arial" w:eastAsia="Arial" w:hAnsi="Arial"/>
-          <w:b w:val="1"/>
-          <w:bCs w:val="1"/>
-          <w:sz w:val="22"/>
-          <w:szCs w:val="22"/>
-          <w:rtl w:val="0"/>
-        </w:rPr>
-        <w:t xml:space="preserve">emergency</w:t>
-      </w:r>
-      <w:r>
-        <w:rPr>
-          <w:rFonts w:ascii="Arial" w:cs="Arial" w:eastAsia="Arial" w:hAnsi="Arial"/>
-          <w:sz w:val="22"/>
-          <w:szCs w:val="22"/>
-          <w:rtl w:val="0"/>
-        </w:rPr>
-        <w:t xml:space="preserve"> model for schools with frequent class disruptions. Procurement delays prevented the Department of Education's implementing unit from supporting standard pilot implementation, and the data collected is based on implementation-ready schools proceeding with their own resources. This report presents a dataset snapshot and descriptive statistics from all datasets provided by the implementing office. </w:t>
+        <w:t>Overview</w:t>
+      </w:r>
+    </w:p>
+    <w:p>
+      <w:pPr>
+        <w:rPr>
+          <w:rFonts w:ascii="Arial" w:cs="Arial" w:eastAsia="Arial" w:hAnsi="Arial"/>
+          <w:sz w:val="22"/>
+          <w:szCs w:val="22"/>
+        </w:rPr>
+      </w:pPr>
+      <w:r>
+        <w:t>The Dynamic Learning Program (DLP), developed by Dr. Christopher Bernido and Dr. Maria Victoria Carpio-Bernido, is an activity-based instructional model that places greater responsibility on students to read, write, and work through exercises before formal classroom discussion. DepEd has recognized DLP as an alternative delivery modality for contexts where conventional instruction is constrained by large class sizes, multiple shifts, or recurring class disruptions.</w:t>
+      </w:r>
+    </w:p>
+    <w:p>
+      <w:pPr>
+        <w:rPr>
+          <w:rFonts w:ascii="Arial" w:cs="Arial" w:eastAsia="Arial" w:hAnsi="Arial"/>
+          <w:sz w:val="22"/>
+          <w:szCs w:val="22"/>
+        </w:rPr>
+      </w:pPr>
+      <w:r>
+        <w:t>The pilot was designed to assess DLP across three implementation contexts: mainstream schools with large classes, schools operating multiple shifts, and schools affected by emergencies or repeated disruptions. One hundred schools were randomly assigned to each treatment context. Because procurement delays limited the planned rollout, the current data mainly describe schools that were able to proceed using their own resources. This brief summarizes the available monitoring and assessment data and should be read as descriptive evidence rather than an estimate of program impact.</w:t>
       </w:r>
     </w:p>
     <w:p>
@@ -174,345 +85,69 @@
         <w:rPr/>
       </w:pPr>
       <w:r>
-        <w:rPr>
-          <w:color w:val="77c181"/>
-          <w:rtl w:val="0"/>
-        </w:rPr>
-        <w:t xml:space="preserve">DATASET PROCESSING</w:t>
-      </w:r>
-      <w:r>
-        <w:rPr>
-          <w:rtl w:val="0"/>
-        </w:rPr>
-      </w:r>
-    </w:p>
-    <w:p>
-      <w:pPr>
-        <w:rPr>
-          <w:rFonts w:ascii="Arial" w:cs="Arial" w:eastAsia="Arial" w:hAnsi="Arial"/>
-          <w:sz w:val="22"/>
-          <w:szCs w:val="22"/>
-        </w:rPr>
-      </w:pPr>
-      <w:r>
-        <w:rPr>
-          <w:rFonts w:ascii="Arial" w:cs="Arial" w:eastAsia="Arial" w:hAnsi="Arial"/>
-          <w:sz w:val="22"/>
-          <w:szCs w:val="22"/>
-          <w:rtl w:val="0"/>
-        </w:rPr>
-        <w:t xml:space="preserve">Using the program’s monitoring data as the base dataset, the final tagging (</w:t>
-      </w:r>
-      <w:r>
-        <w:rPr>
-          <w:rFonts w:ascii="Roboto Mono" w:cs="Roboto Mono" w:eastAsia="Roboto Mono" w:hAnsi="Roboto Mono"/>
-          <w:sz w:val="20"/>
-          <w:szCs w:val="20"/>
-          <w:rtl w:val="0"/>
-        </w:rPr>
-        <w:t xml:space="preserve">rev_status</w:t>
-      </w:r>
-      <w:r>
-        <w:rPr>
-          <w:rFonts w:ascii="Arial" w:cs="Arial" w:eastAsia="Arial" w:hAnsi="Arial"/>
-          <w:sz w:val="22"/>
-          <w:szCs w:val="22"/>
-          <w:vertAlign w:val="superscript"/>
-        </w:rPr>
-        <w:footnoteReference w:customMarkFollows="0" w:id="0"/>
-      </w:r>
-      <w:r>
-        <w:rPr>
-          <w:rFonts w:ascii="Arial" w:cs="Arial" w:eastAsia="Arial" w:hAnsi="Arial"/>
-          <w:sz w:val="22"/>
-          <w:szCs w:val="22"/>
-          <w:rtl w:val="0"/>
-        </w:rPr>
-        <w:t xml:space="preserve">) for 258 schools show that only</w:t>
-      </w:r>
-      <w:r>
-        <w:rPr>
-          <w:rFonts w:ascii="Arial" w:cs="Arial" w:eastAsia="Arial" w:hAnsi="Arial"/>
-          <w:b w:val="1"/>
-          <w:bCs w:val="1"/>
-          <w:sz w:val="22"/>
-          <w:szCs w:val="22"/>
-          <w:rtl w:val="0"/>
-        </w:rPr>
-        <w:t xml:space="preserve"> 41 schools implemented a DLP model</w:t>
-      </w:r>
-      <w:r>
-        <w:rPr>
-          <w:rFonts w:ascii="Arial" w:cs="Arial" w:eastAsia="Arial" w:hAnsi="Arial"/>
-          <w:sz w:val="22"/>
-          <w:szCs w:val="22"/>
-          <w:rtl w:val="0"/>
-        </w:rPr>
-        <w:t xml:space="preserve">  (treatment)</w:t>
-      </w:r>
-    </w:p>
-    <w:p>
-      <w:pPr>
-        <w:rPr>
-          <w:rFonts w:ascii="Arial" w:cs="Arial" w:eastAsia="Arial" w:hAnsi="Arial"/>
-          <w:sz w:val="22"/>
-          <w:szCs w:val="22"/>
-        </w:rPr>
-      </w:pPr>
-      <w:r>
-        <w:rPr>
-          <w:rFonts w:ascii="Arial" w:cs="Arial" w:eastAsia="Arial" w:hAnsi="Arial"/>
-          <w:b w:val="1"/>
-          <w:bCs w:val="1"/>
-          <w:sz w:val="22"/>
-          <w:szCs w:val="22"/>
-          <w:rtl w:val="0"/>
-        </w:rPr>
-        <w:t xml:space="preserve">Figure 1 </w:t>
-      </w:r>
-      <w:r>
-        <w:rPr>
-          <w:rFonts w:ascii="Arial" w:cs="Arial" w:eastAsia="Arial" w:hAnsi="Arial"/>
-          <w:sz w:val="22"/>
-          <w:szCs w:val="22"/>
-          <w:rtl w:val="0"/>
-        </w:rPr>
-        <w:t xml:space="preserve">summarizes</w:t>
-      </w:r>
-      <w:r>
-        <w:rPr>
-          <w:rFonts w:ascii="Arial" w:cs="Arial" w:eastAsia="Arial" w:hAnsi="Arial"/>
-          <w:sz w:val="22"/>
-          <w:szCs w:val="22"/>
-          <w:rtl w:val="0"/>
-        </w:rPr>
-        <w:t xml:space="preserve"> the number of students from pilot schools based on enrollment data, baseline and endline assessments for Math and Reading. </w:t>
-      </w:r>
-      <w:r>
-        <w:rPr>
-          <w:rFonts w:ascii="Arial" w:cs="Arial" w:eastAsia="Arial" w:hAnsi="Arial"/>
-          <w:sz w:val="22"/>
-          <w:szCs w:val="22"/>
-          <w:rtl w:val="0"/>
-        </w:rPr>
-        <w:t xml:space="preserve">Across these schools, there were a total of </w:t>
-      </w:r>
-      <w:r>
-        <w:rPr>
-          <w:rFonts w:ascii="Arial" w:cs="Arial" w:eastAsia="Arial" w:hAnsi="Arial"/>
-          <w:b w:val="1"/>
-          <w:bCs w:val="1"/>
-          <w:sz w:val="22"/>
-          <w:szCs w:val="22"/>
-          <w:rtl w:val="0"/>
-        </w:rPr>
-        <w:t xml:space="preserve">313,009</w:t>
-      </w:r>
-      <w:r>
-        <w:rPr>
-          <w:rFonts w:ascii="Arial" w:cs="Arial" w:eastAsia="Arial" w:hAnsi="Arial"/>
-          <w:sz w:val="22"/>
-          <w:szCs w:val="22"/>
-          <w:rtl w:val="0"/>
-        </w:rPr>
-        <w:t xml:space="preserve"> junior high school students who became part of the pilot. For reading proficiency, the pilot assessed </w:t>
-      </w:r>
-      <w:r>
-        <w:rPr>
-          <w:rFonts w:ascii="Arial" w:cs="Arial" w:eastAsia="Arial" w:hAnsi="Arial"/>
-          <w:b w:val="1"/>
-          <w:bCs w:val="1"/>
-          <w:sz w:val="22"/>
-          <w:szCs w:val="22"/>
-          <w:rtl w:val="0"/>
-        </w:rPr>
-        <w:t xml:space="preserve">94 percent</w:t>
-      </w:r>
-      <w:r>
-        <w:rPr>
-          <w:rFonts w:ascii="Arial" w:cs="Arial" w:eastAsia="Arial" w:hAnsi="Arial"/>
-          <w:sz w:val="22"/>
-          <w:szCs w:val="22"/>
-          <w:rtl w:val="0"/>
-        </w:rPr>
-        <w:t xml:space="preserve"> (295,755) students at the beginning of the school year (BoSY), and</w:t>
-      </w:r>
-      <w:r>
-        <w:rPr>
-          <w:rFonts w:ascii="Arial" w:cs="Arial" w:eastAsia="Arial" w:hAnsi="Arial"/>
-          <w:b w:val="1"/>
-          <w:bCs w:val="1"/>
-          <w:sz w:val="22"/>
-          <w:szCs w:val="22"/>
-          <w:rtl w:val="0"/>
-        </w:rPr>
-        <w:t xml:space="preserve"> 80 percent</w:t>
-      </w:r>
-      <w:r>
-        <w:rPr>
-          <w:rFonts w:ascii="Arial" w:cs="Arial" w:eastAsia="Arial" w:hAnsi="Arial"/>
-          <w:sz w:val="22"/>
-          <w:szCs w:val="22"/>
-          <w:rtl w:val="0"/>
-        </w:rPr>
-        <w:t xml:space="preserve"> (250,696) students</w:t>
-      </w:r>
-      <w:r>
-        <w:rPr>
-          <w:rFonts w:ascii="Arial" w:cs="Arial" w:eastAsia="Arial" w:hAnsi="Arial"/>
-          <w:b w:val="1"/>
-          <w:bCs w:val="1"/>
-          <w:sz w:val="22"/>
-          <w:szCs w:val="22"/>
-          <w:rtl w:val="0"/>
-        </w:rPr>
-        <w:t xml:space="preserve"> </w:t>
-      </w:r>
-      <w:r>
-        <w:rPr>
-          <w:rFonts w:ascii="Arial" w:cs="Arial" w:eastAsia="Arial" w:hAnsi="Arial"/>
-          <w:sz w:val="22"/>
-          <w:szCs w:val="22"/>
-          <w:rtl w:val="0"/>
-        </w:rPr>
-        <w:t xml:space="preserve">at the end of the school year (EoSY) out of the total enrollment. For Math proficiency, the pilot also assessed</w:t>
-      </w:r>
-      <w:r>
-        <w:rPr>
-          <w:rFonts w:ascii="Arial" w:cs="Arial" w:eastAsia="Arial" w:hAnsi="Arial"/>
-          <w:b w:val="1"/>
-          <w:bCs w:val="1"/>
-          <w:sz w:val="22"/>
-          <w:szCs w:val="22"/>
-          <w:rtl w:val="0"/>
-        </w:rPr>
-        <w:t xml:space="preserve"> 94 percent</w:t>
-      </w:r>
-      <w:r>
-        <w:rPr>
-          <w:rFonts w:ascii="Arial" w:cs="Arial" w:eastAsia="Arial" w:hAnsi="Arial"/>
-          <w:sz w:val="22"/>
-          <w:szCs w:val="22"/>
-          <w:rtl w:val="0"/>
-        </w:rPr>
-        <w:t xml:space="preserve"> (294,804) during BoSY, and </w:t>
-      </w:r>
-      <w:r>
-        <w:rPr>
-          <w:rFonts w:ascii="Arial" w:cs="Arial" w:eastAsia="Arial" w:hAnsi="Arial"/>
-          <w:b w:val="1"/>
-          <w:bCs w:val="1"/>
-          <w:sz w:val="22"/>
-          <w:szCs w:val="22"/>
-          <w:rtl w:val="0"/>
-        </w:rPr>
-        <w:t xml:space="preserve">91 percent </w:t>
-      </w:r>
-      <w:r>
-        <w:rPr>
-          <w:rFonts w:ascii="Arial" w:cs="Arial" w:eastAsia="Arial" w:hAnsi="Arial"/>
-          <w:sz w:val="22"/>
-          <w:szCs w:val="22"/>
-          <w:rtl w:val="0"/>
-        </w:rPr>
-        <w:t xml:space="preserve">(283,564) students during EoSY out of the total enrollment.</w:t>
-      </w:r>
-    </w:p>
-    <w:p>
-      <w:pPr>
-        <w:rPr>
-          <w:rFonts w:ascii="Arial" w:cs="Arial" w:eastAsia="Arial" w:hAnsi="Arial"/>
-          <w:sz w:val="22"/>
-          <w:szCs w:val="22"/>
-        </w:rPr>
-      </w:pPr>
-      <w:r>
-        <w:rPr>
-          <w:rtl w:val="0"/>
-        </w:rPr>
-      </w:r>
-    </w:p>
-    <w:p>
-      <w:pPr>
-        <w:rPr>
-          <w:rFonts w:ascii="Arial" w:cs="Arial" w:eastAsia="Arial" w:hAnsi="Arial"/>
-          <w:sz w:val="22"/>
-          <w:szCs w:val="22"/>
-        </w:rPr>
-      </w:pPr>
-      <w:r>
-        <w:rPr>
-          <w:b w:val="1"/>
-          <w:bCs w:val="1"/>
-          <w:color w:val="77c181"/>
-          <w:sz w:val="32"/>
-          <w:szCs w:val="32"/>
-          <w:rtl w:val="0"/>
-        </w:rPr>
-        <w:t xml:space="preserve">SCOPE OF ANALYSIS</w:t>
-      </w:r>
-      <w:r>
-        <w:rPr>
-          <w:rtl w:val="0"/>
-        </w:rPr>
-      </w:r>
-    </w:p>
-    <w:p>
-      <w:pPr>
-        <w:rPr>
-          <w:rFonts w:ascii="Arial" w:cs="Arial" w:eastAsia="Arial" w:hAnsi="Arial"/>
-          <w:sz w:val="22"/>
-          <w:szCs w:val="22"/>
-        </w:rPr>
-      </w:pPr>
-      <w:r>
-        <w:rPr>
-          <w:rFonts w:ascii="Arial" w:cs="Arial" w:eastAsia="Arial" w:hAnsi="Arial"/>
-          <w:sz w:val="22"/>
-          <w:szCs w:val="22"/>
-          <w:rtl w:val="0"/>
-        </w:rPr>
-        <w:t xml:space="preserve">The analysis draws exclusively on datasets provided by DepEd, including baseline and endline rounds of the</w:t>
-      </w:r>
-      <w:r>
-        <w:rPr>
-          <w:rFonts w:ascii="Arial" w:cs="Arial" w:eastAsia="Arial" w:hAnsi="Arial"/>
-          <w:b w:val="1"/>
-          <w:bCs w:val="1"/>
-          <w:sz w:val="22"/>
-          <w:szCs w:val="22"/>
-          <w:rtl w:val="0"/>
-        </w:rPr>
-        <w:t xml:space="preserve"> Rapid Mathematics Assessment (RMA), the Philippine Informal Reading Inventory (Phil-IRI)</w:t>
-      </w:r>
-      <w:r>
-        <w:rPr>
-          <w:rFonts w:ascii="Arial" w:cs="Arial" w:eastAsia="Arial" w:hAnsi="Arial"/>
-          <w:sz w:val="22"/>
-          <w:szCs w:val="22"/>
-          <w:rtl w:val="0"/>
-        </w:rPr>
-        <w:t xml:space="preserve">, and the implementing unit’s </w:t>
-      </w:r>
-      <w:r>
-        <w:rPr>
-          <w:rFonts w:ascii="Arial" w:cs="Arial" w:eastAsia="Arial" w:hAnsi="Arial"/>
-          <w:b w:val="1"/>
-          <w:bCs w:val="1"/>
-          <w:sz w:val="22"/>
-          <w:szCs w:val="22"/>
-          <w:rtl w:val="0"/>
-        </w:rPr>
-        <w:t xml:space="preserve">monitoring data.</w:t>
-      </w:r>
-      <w:r>
-        <w:rPr>
-          <w:rFonts w:ascii="Arial" w:cs="Arial" w:eastAsia="Arial" w:hAnsi="Arial"/>
-          <w:sz w:val="22"/>
-          <w:szCs w:val="22"/>
-          <w:rtl w:val="0"/>
-        </w:rPr>
-        <w:t xml:space="preserve"> The monitoring data do not capture the specific DLP model implemented, the method of implementation, or the timing of implementation during the school year. Implementation rates reflect schools that were able to implement DLP using their own resources.</w:t>
+        <w:t>Dataset Processing</w:t>
+      </w:r>
+    </w:p>
+    <w:p>
+      <w:pPr>
+        <w:rPr>
+          <w:rFonts w:ascii="Arial" w:cs="Arial" w:eastAsia="Arial" w:hAnsi="Arial"/>
+          <w:sz w:val="22"/>
+          <w:szCs w:val="22"/>
+        </w:rPr>
+      </w:pPr>
+      <w:r>
+        <w:t>The monitoring file identifies 258 schools with final implementation status. Of these, 41 schools were recorded as having implemented a DLP model.</w:t>
+      </w:r>
+    </w:p>
+    <w:p>
+      <w:pPr>
+        <w:rPr>
+          <w:rFonts w:ascii="Arial" w:cs="Arial" w:eastAsia="Arial" w:hAnsi="Arial"/>
+          <w:sz w:val="22"/>
+          <w:szCs w:val="22"/>
+        </w:rPr>
+      </w:pPr>
+      <w:r>
+        <w:t>Figure 1 compares enrollment with available assessment records for mathematics and reading. The pilot schools enrolled 313,009 junior high school students. Phil-IRI coverage was 94 percent at the beginning of the school year and 80 percent at the end of the school year. RMA coverage was 94 percent at the beginning of the school year and 91 percent at the end of the school year.</w:t>
+      </w:r>
+    </w:p>
+    <w:p>
+      <w:pPr>
+        <w:rPr>
+          <w:rFonts w:ascii="Arial" w:cs="Arial" w:eastAsia="Arial" w:hAnsi="Arial"/>
+          <w:sz w:val="22"/>
+          <w:szCs w:val="22"/>
+        </w:rPr>
+      </w:pPr>
+      <w:r>
+        <w:rPr>
+          <w:rtl w:val="0"/>
+        </w:rPr>
+      </w:r>
+    </w:p>
+    <w:p>
+      <w:pPr>
+        <w:rPr>
+          <w:rFonts w:ascii="Arial" w:cs="Arial" w:eastAsia="Arial" w:hAnsi="Arial"/>
+          <w:sz w:val="22"/>
+          <w:szCs w:val="22"/>
+        </w:rPr>
+      </w:pPr>
+      <w:r>
+        <w:t>Scope of Analysis</w:t>
+      </w:r>
+    </w:p>
+    <w:p>
+      <w:pPr>
+        <w:rPr>
+          <w:rFonts w:ascii="Arial" w:cs="Arial" w:eastAsia="Arial" w:hAnsi="Arial"/>
+          <w:sz w:val="22"/>
+          <w:szCs w:val="22"/>
+        </w:rPr>
+      </w:pPr>
+      <w:r>
+        <w:t>The analysis uses datasets provided by DepEd: baseline and endline rounds of the Rapid Mathematics Assessment, the Philippine Informal Reading Inventory, and monitoring data from the implementing unit. The monitoring data identify whether a school implemented DLP, but not the specific model used, the intensity or fidelity of implementation, or the timing of implementation during the school year.</w:t>
       </w:r>
     </w:p>
     <w:p>
@@ -635,72 +270,19 @@
         <w:rPr/>
       </w:pPr>
       <w:r>
-        <w:rPr>
-          <w:color w:val="77c181"/>
-          <w:rtl w:val="0"/>
-        </w:rPr>
-        <w:t xml:space="preserve">PROGRAM IMPLEMENTATION</w:t>
-      </w:r>
-      <w:r>
-        <w:rPr>
-          <w:rtl w:val="0"/>
-        </w:rPr>
-      </w:r>
-    </w:p>
-    <w:p>
-      <w:pPr>
-        <w:rPr>
-          <w:rFonts w:ascii="Arial" w:cs="Arial" w:eastAsia="Arial" w:hAnsi="Arial"/>
-          <w:sz w:val="22"/>
-          <w:szCs w:val="22"/>
-        </w:rPr>
-      </w:pPr>
-      <w:r>
-        <w:rPr>
-          <w:rFonts w:ascii="Arial" w:cs="Arial" w:eastAsia="Arial" w:hAnsi="Arial"/>
-          <w:sz w:val="22"/>
-          <w:szCs w:val="22"/>
-          <w:rtl w:val="0"/>
-        </w:rPr>
-        <w:t xml:space="preserve">Based on initial randomization records and implementation status (</w:t>
-      </w:r>
-      <w:r>
-        <w:rPr>
-          <w:rFonts w:ascii="Roboto Mono" w:cs="Roboto Mono" w:eastAsia="Roboto Mono" w:hAnsi="Roboto Mono"/>
-          <w:sz w:val="20"/>
-          <w:szCs w:val="20"/>
-          <w:rtl w:val="0"/>
-        </w:rPr>
-        <w:t xml:space="preserve">rev_status)</w:t>
-      </w:r>
-      <w:r>
-        <w:rPr>
-          <w:rFonts w:ascii="Arial" w:cs="Arial" w:eastAsia="Arial" w:hAnsi="Arial"/>
-          <w:sz w:val="22"/>
-          <w:szCs w:val="22"/>
-          <w:rtl w:val="0"/>
-        </w:rPr>
-        <w:t xml:space="preserve"> data, 16 percent of the 258 schools assigned to a treatment arm (mainstream, shifting, or emergency) were able to </w:t>
-      </w:r>
-      <w:r>
-        <w:rPr>
-          <w:rFonts w:ascii="Arial" w:cs="Arial" w:eastAsia="Arial" w:hAnsi="Arial"/>
-          <w:b w:val="1"/>
-          <w:bCs w:val="1"/>
-          <w:sz w:val="22"/>
-          <w:szCs w:val="22"/>
-          <w:rtl w:val="0"/>
-        </w:rPr>
-        <w:t xml:space="preserve">implement DLP using their own resources</w:t>
-      </w:r>
-      <w:r>
-        <w:rPr>
-          <w:rFonts w:ascii="Arial" w:cs="Arial" w:eastAsia="Arial" w:hAnsi="Arial"/>
-          <w:sz w:val="22"/>
-          <w:szCs w:val="22"/>
-          <w:rtl w:val="0"/>
-        </w:rPr>
-        <w:t xml:space="preserve">. As the standard pilot rollout was still in preparation, these schools proceeded independently ahead of the full pilot launch. The share of schools that implemented DLP was highest among those assigned to the emergency model and lowest among those assigned to the mainstream model.</w:t>
+        <w:t>Program Implementation</w:t>
+      </w:r>
+    </w:p>
+    <w:p>
+      <w:pPr>
+        <w:rPr>
+          <w:rFonts w:ascii="Arial" w:cs="Arial" w:eastAsia="Arial" w:hAnsi="Arial"/>
+          <w:sz w:val="22"/>
+          <w:szCs w:val="22"/>
+        </w:rPr>
+      </w:pPr>
+      <w:r>
+        <w:t>Among schools assigned to a treatment arm, 16 percent were recorded as implementing DLP. These figures reflect implementation ahead of the standard rollout and should be interpreted as early take-up under resource constraints. Implementation was highest among schools assigned to the emergency model and lowest among those assigned to the mainstream model.</w:t>
       </w:r>
     </w:p>
     <w:p>
@@ -1171,97 +753,35 @@
         </w:rPr>
       </w:pPr>
       <w:r>
-        <w:rPr>
-          <w:rFonts w:ascii="Arial" w:cs="Arial" w:eastAsia="Arial" w:hAnsi="Arial"/>
-          <w:b w:val="1"/>
-          <w:bCs w:val="1"/>
+        <w:t>Note: The current dataset does not identify the DLP model actually implemented by each school. Compliance is therefore defined as implementation of any DLP model among schools assigned to a treatment arm.</w:t>
+      </w:r>
+    </w:p>
+    <w:p>
+      <w:pPr>
+        <w:rPr>
+          <w:rFonts w:ascii="Arial" w:cs="Arial" w:eastAsia="Arial" w:hAnsi="Arial"/>
           <w:i w:val="1"/>
           <w:iCs w:val="1"/>
           <w:sz w:val="22"/>
           <w:szCs w:val="22"/>
-          <w:rtl w:val="0"/>
-        </w:rPr>
-        <w:t xml:space="preserve">Note:</w:t>
-      </w:r>
-      <w:r>
-        <w:rPr>
-          <w:rFonts w:ascii="Arial" w:cs="Arial" w:eastAsia="Arial" w:hAnsi="Arial"/>
-          <w:i w:val="1"/>
-          <w:iCs w:val="1"/>
-          <w:sz w:val="22"/>
-          <w:szCs w:val="22"/>
-          <w:rtl w:val="0"/>
-        </w:rPr>
-        <w:t xml:space="preserve"> The current dataset cannot specify which DLP model these schools implemented. Hence, the </w:t>
-      </w:r>
-      <w:r>
-        <w:rPr>
-          <w:rFonts w:ascii="Arial" w:cs="Arial" w:eastAsia="Arial" w:hAnsi="Arial"/>
-          <w:b w:val="1"/>
-          <w:bCs w:val="1"/>
-          <w:i w:val="1"/>
-          <w:iCs w:val="1"/>
-          <w:sz w:val="22"/>
-          <w:szCs w:val="22"/>
-          <w:rtl w:val="0"/>
-        </w:rPr>
-        <w:t xml:space="preserve">compliance rates are based on whether they implemented a DLP model if they are assigned to a treatment arm</w:t>
-      </w:r>
-      <w:r>
-        <w:rPr>
-          <w:rFonts w:ascii="Arial" w:cs="Arial" w:eastAsia="Arial" w:hAnsi="Arial"/>
-          <w:i w:val="1"/>
-          <w:iCs w:val="1"/>
-          <w:sz w:val="22"/>
-          <w:szCs w:val="22"/>
-          <w:rtl w:val="0"/>
-        </w:rPr>
-        <w:t xml:space="preserve">, regardless of the model.</w:t>
-      </w:r>
-    </w:p>
-    <w:p>
-      <w:pPr>
-        <w:rPr>
-          <w:rFonts w:ascii="Arial" w:cs="Arial" w:eastAsia="Arial" w:hAnsi="Arial"/>
-          <w:i w:val="1"/>
-          <w:iCs w:val="1"/>
-          <w:sz w:val="22"/>
-          <w:szCs w:val="22"/>
-        </w:rPr>
-      </w:pPr>
-      <w:r>
-        <w:rPr>
-          <w:rtl w:val="0"/>
-        </w:rPr>
-      </w:r>
-    </w:p>
-    <w:p>
-      <w:pPr>
-        <w:rPr>
-          <w:rFonts w:ascii="Arial" w:cs="Arial" w:eastAsia="Arial" w:hAnsi="Arial"/>
-          <w:sz w:val="22"/>
-          <w:szCs w:val="22"/>
-        </w:rPr>
-      </w:pPr>
-      <w:r>
-        <w:rPr>
-          <w:rFonts w:ascii="Arial" w:cs="Arial" w:eastAsia="Arial" w:hAnsi="Arial"/>
-          <w:b w:val="1"/>
-          <w:bCs w:val="1"/>
-          <w:sz w:val="22"/>
-          <w:szCs w:val="22"/>
-          <w:rtl w:val="0"/>
-        </w:rPr>
-        <w:t xml:space="preserve">Figure 2 </w:t>
-      </w:r>
-      <w:r>
-        <w:rPr>
-          <w:rFonts w:ascii="Arial" w:cs="Arial" w:eastAsia="Arial" w:hAnsi="Arial"/>
-          <w:sz w:val="22"/>
-          <w:szCs w:val="22"/>
-          <w:rtl w:val="0"/>
-        </w:rPr>
-        <w:t xml:space="preserve">summarizes the implementation rates by treatment groups, showing that 17 to 18 percent of pilot schools initially assigned to emergency and shifting were able to implement a DLP model.  </w:t>
+        </w:rPr>
+      </w:pPr>
+      <w:r>
+        <w:rPr>
+          <w:rtl w:val="0"/>
+        </w:rPr>
+      </w:r>
+    </w:p>
+    <w:p>
+      <w:pPr>
+        <w:rPr>
+          <w:rFonts w:ascii="Arial" w:cs="Arial" w:eastAsia="Arial" w:hAnsi="Arial"/>
+          <w:sz w:val="22"/>
+          <w:szCs w:val="22"/>
+        </w:rPr>
+      </w:pPr>
+      <w:r>
+        <w:t>Figure 2 shows implementation rates by treatment assignment. Schools assigned to the emergency and shifting arms had implementation rates of roughly 17 to 18 percent.</w:t>
       </w:r>
     </w:p>
     <w:p>
@@ -1443,38 +963,7 @@
         <w:rPr/>
       </w:pPr>
       <w:r>
-        <w:rPr>
-          <w:rFonts w:ascii="Arial" w:cs="Arial" w:eastAsia="Arial" w:hAnsi="Arial"/>
-          <w:sz w:val="22"/>
-          <w:szCs w:val="22"/>
-          <w:rtl w:val="0"/>
-        </w:rPr>
-        <w:t xml:space="preserve">On the other hand, </w:t>
-      </w:r>
-      <w:r>
-        <w:rPr>
-          <w:rFonts w:ascii="Arial" w:cs="Arial" w:eastAsia="Arial" w:hAnsi="Arial"/>
-          <w:b w:val="1"/>
-          <w:bCs w:val="1"/>
-          <w:sz w:val="22"/>
-          <w:szCs w:val="22"/>
-          <w:rtl w:val="0"/>
-        </w:rPr>
-        <w:t xml:space="preserve">Figure 3 </w:t>
-      </w:r>
-      <w:r>
-        <w:rPr>
-          <w:rFonts w:ascii="Arial" w:cs="Arial" w:eastAsia="Arial" w:hAnsi="Arial"/>
-          <w:sz w:val="22"/>
-          <w:szCs w:val="22"/>
-          <w:rtl w:val="0"/>
-        </w:rPr>
-        <w:t xml:space="preserve">shows that NCR and Bicol regions had the highest shares of schools that were able to implement a DLP model with 23 percent and 18 percent implementation rates, respectively.  </w:t>
-      </w:r>
-      <w:r>
-        <w:rPr>
-          <w:rtl w:val="0"/>
-        </w:rPr>
+        <w:t>Figure 3 shows regional variation in implementation. NCR and Bicol recorded the highest implementation rates, at 23 percent and 18 percent, respectively.</w:t>
       </w:r>
     </w:p>
     <w:p>
@@ -1565,83 +1054,31 @@
         </w:rPr>
       </w:pPr>
       <w:r>
-        <w:rPr>
-          <w:color w:val="77c181"/>
-          <w:rtl w:val="0"/>
-        </w:rPr>
-        <w:t xml:space="preserve">GEOGRAPHIC SUMMARIES</w:t>
-      </w:r>
-      <w:r>
-        <w:rPr>
-          <w:rtl w:val="0"/>
-        </w:rPr>
-      </w:r>
-    </w:p>
-    <w:p>
-      <w:pPr>
-        <w:rPr>
-          <w:rFonts w:ascii="Arial" w:cs="Arial" w:eastAsia="Arial" w:hAnsi="Arial"/>
-          <w:sz w:val="22"/>
-          <w:szCs w:val="22"/>
-        </w:rPr>
-      </w:pPr>
-      <w:r>
-        <w:rPr>
-          <w:rFonts w:ascii="Arial" w:cs="Arial" w:eastAsia="Arial" w:hAnsi="Arial"/>
-          <w:sz w:val="22"/>
-          <w:szCs w:val="22"/>
-          <w:rtl w:val="0"/>
-        </w:rPr>
-        <w:t xml:space="preserve">The randomized schools in this file are spread across five regions. Region 5 has the largest number of schools in the dataset. The coverage rates now use the </w:t>
-      </w:r>
-      <w:r>
-        <w:rPr>
-          <w:rFonts w:ascii="Arial" w:cs="Arial" w:eastAsia="Arial" w:hAnsi="Arial"/>
-          <w:b w:val="1"/>
-          <w:bCs w:val="1"/>
-          <w:sz w:val="22"/>
-          <w:szCs w:val="22"/>
-          <w:rtl w:val="0"/>
-        </w:rPr>
-        <w:t xml:space="preserve">enrollment denominators</w:t>
-      </w:r>
-      <w:r>
-        <w:rPr>
-          <w:rFonts w:ascii="Arial" w:cs="Arial" w:eastAsia="Arial" w:hAnsi="Arial"/>
-          <w:sz w:val="22"/>
-          <w:szCs w:val="22"/>
-          <w:rtl w:val="0"/>
-        </w:rPr>
-        <w:t xml:space="preserve"> from the assessment dashboard files, so the regional rates stay below 100 percent.</w:t>
-      </w:r>
-    </w:p>
-    <w:p>
-      <w:pPr>
-        <w:rPr>
-          <w:rFonts w:ascii="Arial" w:cs="Arial" w:eastAsia="Arial" w:hAnsi="Arial"/>
-          <w:sz w:val="22"/>
-          <w:szCs w:val="22"/>
-        </w:rPr>
-      </w:pPr>
-      <w:r>
-        <w:rPr>
-          <w:rFonts w:ascii="Arial" w:cs="Arial" w:eastAsia="Arial" w:hAnsi="Arial"/>
-          <w:b w:val="1"/>
-          <w:bCs w:val="1"/>
-          <w:sz w:val="22"/>
-          <w:szCs w:val="22"/>
-          <w:rtl w:val="0"/>
-        </w:rPr>
-        <w:t xml:space="preserve">Figure 4 </w:t>
-      </w:r>
-      <w:r>
-        <w:rPr>
-          <w:rFonts w:ascii="Arial" w:cs="Arial" w:eastAsia="Arial" w:hAnsi="Arial"/>
-          <w:sz w:val="22"/>
-          <w:szCs w:val="22"/>
-          <w:rtl w:val="0"/>
-        </w:rPr>
-        <w:t xml:space="preserve">shows that assessment coverage from BoSY to EoSY was relatively high across all regions.</w:t>
+        <w:t>Geographic Summaries</w:t>
+      </w:r>
+    </w:p>
+    <w:p>
+      <w:pPr>
+        <w:rPr>
+          <w:rFonts w:ascii="Arial" w:cs="Arial" w:eastAsia="Arial" w:hAnsi="Arial"/>
+          <w:sz w:val="22"/>
+          <w:szCs w:val="22"/>
+        </w:rPr>
+      </w:pPr>
+      <w:r>
+        <w:t>The randomized schools are distributed across five regions, with Region V accounting for the largest share of schools in the dataset. Assessment coverage is calculated using enrollment denominators from the assessment dashboard files.</w:t>
+      </w:r>
+    </w:p>
+    <w:p>
+      <w:pPr>
+        <w:rPr>
+          <w:rFonts w:ascii="Arial" w:cs="Arial" w:eastAsia="Arial" w:hAnsi="Arial"/>
+          <w:sz w:val="22"/>
+          <w:szCs w:val="22"/>
+        </w:rPr>
+      </w:pPr>
+      <w:r>
+        <w:t>Figure 4 indicates that assessment coverage remained relatively high across regions between the beginning and end of the school year.</w:t>
       </w:r>
     </w:p>
     <w:p>
@@ -2765,125 +2202,50 @@
         <w:rPr/>
       </w:pPr>
       <w:r>
-        <w:rPr>
-          <w:color w:val="77c181"/>
-          <w:rtl w:val="0"/>
-        </w:rPr>
-        <w:t xml:space="preserve">PROFICIENCY AND READING CATEGORIES                         (All Pilot Schools)</w:t>
-      </w:r>
-      <w:r>
-        <w:rPr>
-          <w:rtl w:val="0"/>
-        </w:rPr>
-      </w:r>
-    </w:p>
-    <w:p>
-      <w:pPr>
-        <w:rPr>
-          <w:rFonts w:ascii="Arial" w:cs="Arial" w:eastAsia="Arial" w:hAnsi="Arial"/>
-          <w:sz w:val="22"/>
-          <w:szCs w:val="22"/>
-        </w:rPr>
-      </w:pPr>
-      <w:r>
-        <w:rPr>
-          <w:rFonts w:ascii="Arial" w:cs="Arial" w:eastAsia="Arial" w:hAnsi="Arial"/>
-          <w:sz w:val="22"/>
-          <w:szCs w:val="22"/>
-          <w:rtl w:val="0"/>
-        </w:rPr>
-        <w:t xml:space="preserve">To assess the proficiency of Junior High School students in pilot schools, we leveraged the </w:t>
-      </w:r>
-      <w:r>
+        <w:t>Proficiency and Reading Categories (All Pilot Schools)</w:t>
+      </w:r>
+    </w:p>
+    <w:p>
+      <w:pPr>
+        <w:rPr>
+          <w:rFonts w:ascii="Arial" w:cs="Arial" w:eastAsia="Arial" w:hAnsi="Arial"/>
+          <w:sz w:val="22"/>
+          <w:szCs w:val="22"/>
+        </w:rPr>
+      </w:pPr>
+      <w:r>
+        <w:t>Student performance is summarized using the Rapid Mathematics Assessment for mathematics and Phil-IRI for reading. The figures compare beginning- and end-of-school-year assessment distributions among assessed students.</w:t>
+      </w:r>
+    </w:p>
+    <w:p>
+      <w:pPr>
+        <w:rPr>
+          <w:rFonts w:ascii="Arial" w:cs="Arial" w:eastAsia="Arial" w:hAnsi="Arial"/>
+          <w:sz w:val="22"/>
+          <w:szCs w:val="22"/>
+        </w:rPr>
+      </w:pPr>
+      <w:r>
+        <w:t>In mathematics, the beginning-of-year distribution was concentrated in the not proficient category. By endline, the share of assessed students in this category was substantially lower across Grades 7 to 10.</w:t>
+      </w:r>
+    </w:p>
+    <w:p>
+      <w:r>
+        <w:br w:type="page"/>
+      </w:r>
+    </w:p>
+    <w:p>
+      <w:pPr>
         <w:rPr>
           <w:rFonts w:ascii="Arial" w:cs="Arial" w:eastAsia="Arial" w:hAnsi="Arial"/>
           <w:b w:val="1"/>
           <w:bCs w:val="1"/>
           <w:sz w:val="22"/>
           <w:szCs w:val="22"/>
-          <w:rtl w:val="0"/>
-        </w:rPr>
-        <w:t xml:space="preserve">Rapid Mathematics Assessment (RMA) results</w:t>
-      </w:r>
-      <w:r>
-        <w:rPr>
-          <w:rFonts w:ascii="Arial" w:cs="Arial" w:eastAsia="Arial" w:hAnsi="Arial"/>
-          <w:sz w:val="22"/>
-          <w:szCs w:val="22"/>
-          <w:rtl w:val="0"/>
-        </w:rPr>
-        <w:t xml:space="preserve"> to assess math performance, and the </w:t>
-      </w:r>
-      <w:r>
-        <w:rPr>
-          <w:rFonts w:ascii="Arial" w:cs="Arial" w:eastAsia="Arial" w:hAnsi="Arial"/>
-          <w:b w:val="1"/>
-          <w:bCs w:val="1"/>
-          <w:sz w:val="22"/>
-          <w:szCs w:val="22"/>
-          <w:rtl w:val="0"/>
-        </w:rPr>
-        <w:t xml:space="preserve">Philippine Informal Reading Inventory (Phil-IRI)</w:t>
-      </w:r>
-      <w:r>
-        <w:rPr>
-          <w:rFonts w:ascii="Arial" w:cs="Arial" w:eastAsia="Arial" w:hAnsi="Arial"/>
-          <w:sz w:val="22"/>
-          <w:szCs w:val="22"/>
-          <w:rtl w:val="0"/>
-        </w:rPr>
-        <w:t xml:space="preserve"> results to assess their reading proficiency. </w:t>
-      </w:r>
-    </w:p>
-    <w:p>
-      <w:pPr>
-        <w:rPr>
-          <w:rFonts w:ascii="Arial" w:cs="Arial" w:eastAsia="Arial" w:hAnsi="Arial"/>
-          <w:sz w:val="22"/>
-          <w:szCs w:val="22"/>
-        </w:rPr>
-      </w:pPr>
-      <w:r>
-        <w:rPr>
-          <w:rFonts w:ascii="Arial" w:cs="Arial" w:eastAsia="Arial" w:hAnsi="Arial"/>
-          <w:b w:val="1"/>
-          <w:bCs w:val="1"/>
-          <w:sz w:val="22"/>
-          <w:szCs w:val="22"/>
-          <w:rtl w:val="0"/>
-        </w:rPr>
-        <w:t xml:space="preserve">RMA </w:t>
-      </w:r>
-      <w:r>
-        <w:rPr>
-          <w:rFonts w:ascii="Arial" w:cs="Arial" w:eastAsia="Arial" w:hAnsi="Arial"/>
-          <w:sz w:val="22"/>
-          <w:szCs w:val="22"/>
-          <w:rtl w:val="0"/>
-        </w:rPr>
-        <w:t xml:space="preserve">results are concentrated in the not proficient group in BoSY and noticeably reduced by half in EoSY. This pattern is visible across Grades 7 to 10.</w:t>
-      </w:r>
-    </w:p>
-    <w:p>
-      <w:pPr>
-        <w:rPr>
-          <w:rFonts w:ascii="Arial" w:cs="Arial" w:eastAsia="Arial" w:hAnsi="Arial"/>
-          <w:b w:val="1"/>
-          <w:bCs w:val="1"/>
-          <w:sz w:val="22"/>
-          <w:szCs w:val="22"/>
-        </w:rPr>
-      </w:pPr>
-      <w:r>
-        <w:rPr>
-          <w:rFonts w:ascii="Arial" w:cs="Arial" w:eastAsia="Arial" w:hAnsi="Arial"/>
-          <w:b w:val="1"/>
-          <w:bCs w:val="1"/>
-          <w:sz w:val="22"/>
-          <w:szCs w:val="22"/>
-          <w:rtl w:val="0"/>
-        </w:rPr>
-        <w:t xml:space="preserve">Table 2. Share of assessed students across Grade 7 to 10</w:t>
+        </w:rPr>
+      </w:pPr>
+      <w:r>
+        <w:t>Table 3. Share of assessed students across Grade 7 to 10</w:t>
       </w:r>
     </w:p>
     <w:tbl>
@@ -3235,33 +2597,21 @@
         </w:rPr>
       </w:pPr>
       <w:r>
-        <w:rPr>
-          <w:rFonts w:ascii="Arial" w:cs="Arial" w:eastAsia="Arial" w:hAnsi="Arial"/>
-          <w:sz w:val="22"/>
-          <w:szCs w:val="22"/>
-          <w:rtl w:val="0"/>
-        </w:rPr>
-        <w:t xml:space="preserve">For the </w:t>
-      </w:r>
-      <w:r>
+        <w:t>For Phil-IRI, beginning-of-year data include both 2-level and 3-level reading categories. The end-of-year file does not contain the same fields, so the independent category is used as the closest available proxy for grade readiness in the comparison figures.</w:t>
+      </w:r>
+    </w:p>
+    <w:p>
+      <w:pPr>
         <w:rPr>
           <w:rFonts w:ascii="Arial" w:cs="Arial" w:eastAsia="Arial" w:hAnsi="Arial"/>
           <w:b w:val="1"/>
           <w:bCs w:val="1"/>
           <w:sz w:val="22"/>
           <w:szCs w:val="22"/>
-          <w:rtl w:val="0"/>
-        </w:rPr>
-        <w:t xml:space="preserve">Philippine Informal Reading Inventory (Phil-IRI)</w:t>
-      </w:r>
-      <w:r>
-        <w:rPr>
-          <w:rFonts w:ascii="Arial" w:cs="Arial" w:eastAsia="Arial" w:hAnsi="Arial"/>
-          <w:sz w:val="22"/>
-          <w:szCs w:val="22"/>
-          <w:rtl w:val="0"/>
-        </w:rPr>
-        <w:t xml:space="preserve">, the BoSY data has separate 2-level and 3-level reading categories. The EoSY data does not have the same 2-level and 3-level fields, so the category independent is used as a proxy for grade ready in the comparison figures. </w:t>
+        </w:rPr>
+      </w:pPr>
+      <w:r>
+        <w:t>Figure 5 presents the mathematics proficiency distribution by grade and assessment round. Figure 6 presents the comparable reading pattern, using the available Phil-IRI categories and the endline proxy described above.</w:t>
       </w:r>
     </w:p>
     <w:p>
@@ -3275,80 +2625,7 @@
         </w:rPr>
       </w:pPr>
       <w:r>
-        <w:rPr>
-          <w:rFonts w:ascii="Arial" w:cs="Arial" w:eastAsia="Arial" w:hAnsi="Arial"/>
-          <w:sz w:val="22"/>
-          <w:szCs w:val="22"/>
-          <w:rtl w:val="0"/>
-        </w:rPr>
-        <w:t xml:space="preserve">For Math, </w:t>
-      </w:r>
-      <w:r>
-        <w:rPr>
-          <w:rFonts w:ascii="Arial" w:cs="Arial" w:eastAsia="Arial" w:hAnsi="Arial"/>
-          <w:b w:val="1"/>
-          <w:bCs w:val="1"/>
-          <w:sz w:val="22"/>
-          <w:szCs w:val="22"/>
-          <w:rtl w:val="0"/>
-        </w:rPr>
-        <w:t xml:space="preserve">Figure 5</w:t>
-      </w:r>
-      <w:r>
-        <w:rPr>
-          <w:rFonts w:ascii="Arial" w:cs="Arial" w:eastAsia="Arial" w:hAnsi="Arial"/>
-          <w:sz w:val="22"/>
-          <w:szCs w:val="22"/>
-          <w:rtl w:val="0"/>
-        </w:rPr>
-        <w:t xml:space="preserve"> summarizes the shares of students assessed and their proficiency outcomes from BoSY to EoSY, showing a reduced number of “Not proficient” students across all grade levels. For Reading, </w:t>
-      </w:r>
-      <w:r>
-        <w:rPr>
-          <w:rFonts w:ascii="Arial" w:cs="Arial" w:eastAsia="Arial" w:hAnsi="Arial"/>
-          <w:b w:val="1"/>
-          <w:bCs w:val="1"/>
-          <w:sz w:val="22"/>
-          <w:szCs w:val="22"/>
-          <w:rtl w:val="0"/>
-        </w:rPr>
-        <w:t xml:space="preserve">Figure 6</w:t>
-      </w:r>
-      <w:r>
-        <w:rPr>
-          <w:rFonts w:ascii="Arial" w:cs="Arial" w:eastAsia="Arial" w:hAnsi="Arial"/>
-          <w:sz w:val="22"/>
-          <w:szCs w:val="22"/>
-          <w:rtl w:val="0"/>
-        </w:rPr>
-        <w:t xml:space="preserve"> shows an increased share of students who were “Grade ready” or independent readers and instructional readers.</w:t>
-      </w:r>
-      <w:r>
-        <w:rPr>
-          <w:rtl w:val="0"/>
-        </w:rPr>
-      </w:r>
-    </w:p>
-    <w:p>
-      <w:pPr>
-        <w:rPr>
-          <w:rFonts w:ascii="Arial" w:cs="Arial" w:eastAsia="Arial" w:hAnsi="Arial"/>
-          <w:b w:val="1"/>
-          <w:bCs w:val="1"/>
-          <w:sz w:val="22"/>
-          <w:szCs w:val="22"/>
-        </w:rPr>
-      </w:pPr>
-      <w:r>
-        <w:rPr>
-          <w:rFonts w:ascii="Arial" w:cs="Arial" w:eastAsia="Arial" w:hAnsi="Arial"/>
-          <w:b w:val="1"/>
-          <w:bCs w:val="1"/>
-          <w:sz w:val="22"/>
-          <w:szCs w:val="22"/>
-          <w:rtl w:val="0"/>
-        </w:rPr>
-        <w:t xml:space="preserve">Table 3. Share of independent readers from BoSY to EoSY</w:t>
+        <w:t>Table 4. Share of independent readers from BoSY to EoSY</w:t>
       </w:r>
     </w:p>
     <w:tbl>
@@ -3857,72 +3134,31 @@
         <w:rPr/>
       </w:pPr>
       <w:r>
-        <w:rPr>
-          <w:color w:val="77c181"/>
-          <w:rtl w:val="0"/>
-        </w:rPr>
-        <w:t xml:space="preserve">SUBGROUP PATTERNS (treatment group)</w:t>
-      </w:r>
-      <w:r>
-        <w:rPr>
-          <w:rtl w:val="0"/>
-        </w:rPr>
-      </w:r>
-    </w:p>
-    <w:p>
-      <w:pPr>
-        <w:rPr>
-          <w:rFonts w:ascii="Arial" w:cs="Arial" w:eastAsia="Arial" w:hAnsi="Arial"/>
-          <w:sz w:val="22"/>
-          <w:szCs w:val="22"/>
-        </w:rPr>
-      </w:pPr>
-      <w:r>
-        <w:rPr>
-          <w:rFonts w:ascii="Arial" w:cs="Arial" w:eastAsia="Arial" w:hAnsi="Arial"/>
-          <w:sz w:val="22"/>
-          <w:szCs w:val="22"/>
-          <w:rtl w:val="0"/>
-        </w:rPr>
-        <w:t xml:space="preserve">We also look into the Math and Reading score patterns of</w:t>
-      </w:r>
-      <w:r>
-        <w:rPr>
-          <w:rFonts w:ascii="Arial" w:cs="Arial" w:eastAsia="Arial" w:hAnsi="Arial"/>
-          <w:b w:val="1"/>
-          <w:bCs w:val="1"/>
-          <w:sz w:val="22"/>
-          <w:szCs w:val="22"/>
-          <w:rtl w:val="0"/>
-        </w:rPr>
-        <w:t xml:space="preserve"> treatment schools</w:t>
-      </w:r>
-      <w:r>
-        <w:rPr>
-          <w:rFonts w:ascii="Arial" w:cs="Arial" w:eastAsia="Arial" w:hAnsi="Arial"/>
-          <w:sz w:val="22"/>
-          <w:szCs w:val="22"/>
-          <w:rtl w:val="0"/>
-        </w:rPr>
-        <w:t xml:space="preserve"> by comparing BoSY and EoSY assessment scores. </w:t>
-      </w:r>
-    </w:p>
-    <w:p>
-      <w:pPr>
-        <w:rPr>
-          <w:rFonts w:ascii="Arial" w:cs="Arial" w:eastAsia="Arial" w:hAnsi="Arial"/>
-          <w:sz w:val="22"/>
-          <w:szCs w:val="22"/>
-        </w:rPr>
-      </w:pPr>
-      <w:r>
-        <w:rPr>
-          <w:rFonts w:ascii="Arial" w:cs="Arial" w:eastAsia="Arial" w:hAnsi="Arial"/>
-          <w:sz w:val="22"/>
-          <w:szCs w:val="22"/>
-          <w:rtl w:val="0"/>
-        </w:rPr>
-        <w:t xml:space="preserve">For Math, Figure 7 shows an improvement of students' performance, as the share of students tagged as “Not proficient” reduced by 37 percent out of the total students assessed among treatment schools.</w:t>
+        <w:t>Subgroup Patterns (Treatment Schools)</w:t>
+      </w:r>
+    </w:p>
+    <w:p>
+      <w:pPr>
+        <w:rPr>
+          <w:rFonts w:ascii="Arial" w:cs="Arial" w:eastAsia="Arial" w:hAnsi="Arial"/>
+          <w:sz w:val="22"/>
+          <w:szCs w:val="22"/>
+        </w:rPr>
+      </w:pPr>
+      <w:r>
+        <w:t>For treatment schools, the brief also summarizes changes in mathematics and reading distributions between the beginning and end of the school year.</w:t>
+      </w:r>
+    </w:p>
+    <w:p>
+      <w:pPr>
+        <w:rPr>
+          <w:rFonts w:ascii="Arial" w:cs="Arial" w:eastAsia="Arial" w:hAnsi="Arial"/>
+          <w:sz w:val="22"/>
+          <w:szCs w:val="22"/>
+        </w:rPr>
+      </w:pPr>
+      <w:r>
+        <w:t>In mathematics, Figure 7 shows a lower share of assessed students classified as not proficient at endline among treatment schools.</w:t>
       </w:r>
     </w:p>
     <w:p>
@@ -4009,15 +3245,23 @@
         </w:rPr>
       </w:pPr>
       <w:r>
+        <w:t>Note: Figures report the percent share of assessed students.</w:t>
+      </w:r>
+    </w:p>
+    <w:p>
+      <w:pPr>
         <w:rPr>
           <w:rFonts w:ascii="Arial" w:cs="Arial" w:eastAsia="Arial" w:hAnsi="Arial"/>
           <w:i w:val="1"/>
           <w:iCs w:val="1"/>
           <w:sz w:val="22"/>
           <w:szCs w:val="22"/>
-          <w:rtl w:val="0"/>
-        </w:rPr>
-        <w:t xml:space="preserve">Note: Figures are in % share out of total assessed students</w:t>
+        </w:rPr>
+      </w:pPr>
+      <w:r>
+        <w:rPr>
+          <w:rtl w:val="0"/>
+        </w:rPr>
       </w:r>
     </w:p>
     <w:p>
@@ -4031,54 +3275,7 @@
         </w:rPr>
       </w:pPr>
       <w:r>
-        <w:rPr>
-          <w:rtl w:val="0"/>
-        </w:rPr>
-      </w:r>
-    </w:p>
-    <w:p>
-      <w:pPr>
-        <w:rPr>
-          <w:rFonts w:ascii="Arial" w:cs="Arial" w:eastAsia="Arial" w:hAnsi="Arial"/>
-          <w:i w:val="1"/>
-          <w:iCs w:val="1"/>
-          <w:sz w:val="22"/>
-          <w:szCs w:val="22"/>
-        </w:rPr>
-      </w:pPr>
-      <w:r>
-        <w:rPr>
-          <w:rFonts w:ascii="Arial" w:cs="Arial" w:eastAsia="Arial" w:hAnsi="Arial"/>
-          <w:sz w:val="22"/>
-          <w:szCs w:val="22"/>
-          <w:rtl w:val="0"/>
-        </w:rPr>
-        <w:t xml:space="preserve">For Phil-IRI, BoSY uses the 2-level and 3-level independent categories.EoSY independent is shown as a proxy because the EoSY results do not include the same 2-level and 3-level fields. Using these indicators, </w:t>
-      </w:r>
-      <w:r>
-        <w:rPr>
-          <w:rFonts w:ascii="Arial" w:cs="Arial" w:eastAsia="Arial" w:hAnsi="Arial"/>
-          <w:b w:val="1"/>
-          <w:bCs w:val="1"/>
-          <w:sz w:val="22"/>
-          <w:szCs w:val="22"/>
-          <w:rtl w:val="0"/>
-        </w:rPr>
-        <w:t xml:space="preserve">Figure 8 </w:t>
-      </w:r>
-      <w:r>
-        <w:rPr>
-          <w:rFonts w:ascii="Arial" w:cs="Arial" w:eastAsia="Arial" w:hAnsi="Arial"/>
-          <w:sz w:val="22"/>
-          <w:szCs w:val="22"/>
-          <w:rtl w:val="0"/>
-        </w:rPr>
-        <w:t xml:space="preserve">shows an increased share of students reading at a grade ready level, or independently from BoSY to EoSY among treatment schools.</w:t>
-      </w:r>
-      <w:r>
-        <w:rPr>
-          <w:rtl w:val="0"/>
-        </w:rPr>
+        <w:t>For Phil-IRI, Figure 8 compares the available beginning-of-year independent reading categories with the endline independent-reader proxy. The pattern suggests a higher share of assessed students reading at or near grade-ready levels by the end of the school year among treatment schools.</w:t>
       </w:r>
     </w:p>
     <w:p>
@@ -4169,15 +3366,7 @@
         </w:rPr>
       </w:pPr>
       <w:r>
-        <w:rPr>
-          <w:rFonts w:ascii="Arial" w:cs="Arial" w:eastAsia="Arial" w:hAnsi="Arial"/>
-          <w:i w:val="1"/>
-          <w:iCs w:val="1"/>
-          <w:sz w:val="22"/>
-          <w:szCs w:val="22"/>
-          <w:rtl w:val="0"/>
-        </w:rPr>
-        <w:t xml:space="preserve">Note: Figures are in % share out of total assessed students</w:t>
+        <w:t>Note: Figures report the percent share of assessed students.</w:t>
       </w:r>
     </w:p>
     <w:p>
@@ -4227,43 +3416,22 @@
         </w:rPr>
       </w:pPr>
       <w:r>
-        <w:rPr>
+        <w:t>Preliminary Findings, Data Constraints, and Rollout Considerations</w:t>
+      </w:r>
+    </w:p>
+    <w:p>
+      <w:pPr>
+        <w:spacing w:after="240" w:before="240" w:lineRule="auto"/>
+        <w:rPr>
+          <w:rFonts w:ascii="Arial" w:cs="Arial" w:eastAsia="Arial" w:hAnsi="Arial"/>
           <w:b w:val="1"/>
           <w:bCs w:val="1"/>
-          <w:color w:val="77c181"/>
-          <w:sz w:val="32"/>
-          <w:szCs w:val="32"/>
-          <w:rtl w:val="0"/>
-        </w:rPr>
-        <w:t xml:space="preserve">Preliminary Findings, Data Notes, and Implementation Recommendations</w:t>
-      </w:r>
-      <w:r>
-        <w:rPr>
-          <w:rtl w:val="0"/>
-        </w:rPr>
-      </w:r>
-    </w:p>
-    <w:p>
-      <w:pPr>
-        <w:spacing w:after="240" w:before="240" w:lineRule="auto"/>
-        <w:rPr>
-          <w:rFonts w:ascii="Arial" w:cs="Arial" w:eastAsia="Arial" w:hAnsi="Arial"/>
-          <w:b w:val="1"/>
-          <w:bCs w:val="1"/>
-          <w:sz w:val="22"/>
-          <w:szCs w:val="22"/>
-        </w:rPr>
-      </w:pPr>
-      <w:r>
-        <w:rPr>
-          <w:rFonts w:ascii="Arial" w:cs="Arial" w:eastAsia="Arial" w:hAnsi="Arial"/>
-          <w:b w:val="1"/>
-          <w:bCs w:val="1"/>
-          <w:sz w:val="22"/>
-          <w:szCs w:val="22"/>
-          <w:rtl w:val="0"/>
-        </w:rPr>
-        <w:t xml:space="preserve">Data Notes and Constraints</w:t>
+          <w:sz w:val="22"/>
+          <w:szCs w:val="22"/>
+        </w:rPr>
+      </w:pPr>
+      <w:r>
+        <w:t>Data Constraints</w:t>
       </w:r>
     </w:p>
     <w:p>
@@ -4281,24 +3449,7 @@
         </w:rPr>
       </w:pPr>
       <w:r>
-        <w:rPr>
-          <w:rFonts w:ascii="Arial" w:cs="Arial" w:eastAsia="Arial" w:hAnsi="Arial"/>
-          <w:b w:val="1"/>
-          <w:bCs w:val="1"/>
-          <w:sz w:val="22"/>
-          <w:szCs w:val="22"/>
-          <w:rtl w:val="0"/>
-        </w:rPr>
-        <w:t xml:space="preserve">The analysis draws exclusively on datasets available through DepEd</w:t>
-      </w:r>
-      <w:r>
-        <w:rPr>
-          <w:rFonts w:ascii="Arial" w:cs="Arial" w:eastAsia="Arial" w:hAnsi="Arial"/>
-          <w:sz w:val="22"/>
-          <w:szCs w:val="22"/>
-          <w:rtl w:val="0"/>
-        </w:rPr>
-        <w:t xml:space="preserve">, comprising baseline and endline assessments for reading and mathematics, and monitoring data collected by the program owner.</w:t>
+        <w:t>The analysis is limited to the DepEd datasets available at the time of reporting: reading and mathematics assessment files and program monitoring data.</w:t>
       </w:r>
     </w:p>
     <w:p>
@@ -4316,24 +3467,7 @@
         </w:rPr>
       </w:pPr>
       <w:r>
-        <w:rPr>
-          <w:rFonts w:ascii="Arial" w:cs="Arial" w:eastAsia="Arial" w:hAnsi="Arial"/>
-          <w:b w:val="1"/>
-          <w:bCs w:val="1"/>
-          <w:sz w:val="22"/>
-          <w:szCs w:val="22"/>
-          <w:rtl w:val="0"/>
-        </w:rPr>
-        <w:t xml:space="preserve">Implementation rates are </w:t>
-      </w:r>
-      <w:r>
-        <w:rPr>
-          <w:rFonts w:ascii="Arial" w:cs="Arial" w:eastAsia="Arial" w:hAnsi="Arial"/>
-          <w:sz w:val="22"/>
-          <w:szCs w:val="22"/>
-          <w:rtl w:val="0"/>
-        </w:rPr>
-        <w:t xml:space="preserve">based on the monitoring data provided, tagging schools whether they implemented a DLP model (binary: yes or no for control schools). It does not include information on which DLP model they implemented. Full compliance cannot therefore be determined from the available data.</w:t>
+        <w:t>Implementation is measured as a binary indicator in the monitoring data. The file does not identify the DLP model implemented by each school, so model-specific compliance cannot be assessed.</w:t>
       </w:r>
     </w:p>
     <w:p>
@@ -4351,47 +3485,22 @@
         </w:rPr>
       </w:pPr>
       <w:r>
+        <w:t>The monitoring data also do not capture implementation timing, dosage, fidelity, or classroom-level adherence to the model.</w:t>
+      </w:r>
+    </w:p>
+    <w:p>
+      <w:pPr>
+        <w:spacing w:after="240" w:before="240" w:lineRule="auto"/>
         <w:rPr>
           <w:rFonts w:ascii="Arial" w:cs="Arial" w:eastAsia="Arial" w:hAnsi="Arial"/>
           <w:b w:val="1"/>
           <w:bCs w:val="1"/>
           <w:sz w:val="22"/>
           <w:szCs w:val="22"/>
-          <w:rtl w:val="0"/>
-        </w:rPr>
-        <w:t xml:space="preserve">Monitoring data does not capture</w:t>
-      </w:r>
-      <w:r>
-        <w:rPr>
-          <w:rFonts w:ascii="Arial" w:cs="Arial" w:eastAsia="Arial" w:hAnsi="Arial"/>
-          <w:sz w:val="22"/>
-          <w:szCs w:val="22"/>
-          <w:rtl w:val="0"/>
-        </w:rPr>
-        <w:t xml:space="preserve"> how DLP was implemented, or when it was implemented during the school year.</w:t>
-      </w:r>
-    </w:p>
-    <w:p>
-      <w:pPr>
-        <w:spacing w:after="240" w:before="240" w:lineRule="auto"/>
-        <w:rPr>
-          <w:rFonts w:ascii="Arial" w:cs="Arial" w:eastAsia="Arial" w:hAnsi="Arial"/>
-          <w:b w:val="1"/>
-          <w:bCs w:val="1"/>
-          <w:sz w:val="22"/>
-          <w:szCs w:val="22"/>
-        </w:rPr>
-      </w:pPr>
-      <w:r>
-        <w:rPr>
-          <w:rFonts w:ascii="Arial" w:cs="Arial" w:eastAsia="Arial" w:hAnsi="Arial"/>
-          <w:b w:val="1"/>
-          <w:bCs w:val="1"/>
-          <w:sz w:val="22"/>
-          <w:szCs w:val="22"/>
-          <w:rtl w:val="0"/>
-        </w:rPr>
-        <w:t xml:space="preserve">Preliminary Findings Interpretability</w:t>
+        </w:rPr>
+      </w:pPr>
+      <w:r>
+        <w:t>Interpretation of Descriptive Patterns</w:t>
       </w:r>
     </w:p>
     <w:p>
@@ -4409,24 +3518,7 @@
         </w:rPr>
       </w:pPr>
       <w:r>
-        <w:rPr>
-          <w:rFonts w:ascii="Arial" w:cs="Arial" w:eastAsia="Arial" w:hAnsi="Arial"/>
-          <w:b w:val="1"/>
-          <w:bCs w:val="1"/>
-          <w:sz w:val="22"/>
-          <w:szCs w:val="22"/>
-          <w:rtl w:val="0"/>
-        </w:rPr>
-        <w:t xml:space="preserve">The figures presented in this section are descriptive only.</w:t>
-      </w:r>
-      <w:r>
-        <w:rPr>
-          <w:rFonts w:ascii="Arial" w:cs="Arial" w:eastAsia="Arial" w:hAnsi="Arial"/>
-          <w:sz w:val="22"/>
-          <w:szCs w:val="22"/>
-          <w:rtl w:val="0"/>
-        </w:rPr>
-        <w:t xml:space="preserve"> They are intended to characterize the current data and are not estimates of program impact.</w:t>
+        <w:t>The figures are descriptive. They characterize the available data and should not be interpreted as causal estimates of DLP effects.</w:t>
       </w:r>
     </w:p>
     <w:p>
@@ -4444,24 +3536,7 @@
         </w:rPr>
       </w:pPr>
       <w:r>
-        <w:rPr>
-          <w:rFonts w:ascii="Arial" w:cs="Arial" w:eastAsia="Arial" w:hAnsi="Arial"/>
-          <w:sz w:val="22"/>
-          <w:szCs w:val="22"/>
-          <w:rtl w:val="0"/>
-        </w:rPr>
-        <w:t xml:space="preserve">Control schools are excluded from the reading and mathematics performance figures.</w:t>
-      </w:r>
-      <w:r>
-        <w:rPr>
-          <w:rFonts w:ascii="Arial" w:cs="Arial" w:eastAsia="Arial" w:hAnsi="Arial"/>
-          <w:b w:val="1"/>
-          <w:bCs w:val="1"/>
-          <w:sz w:val="22"/>
-          <w:szCs w:val="22"/>
-          <w:rtl w:val="0"/>
-        </w:rPr>
-        <w:t xml:space="preserve"> A treatment-control comparison is not meaningful at this stage and risks misinterpretation.</w:t>
+        <w:t>Treatment-control comparisons are not presented for performance outcomes at this stage, given the limited implementation captured in the monitoring file and the risk of misinterpreting simple differences as program impacts.</w:t>
       </w:r>
     </w:p>
     <w:p>
@@ -4479,56 +3554,22 @@
         </w:rPr>
       </w:pPr>
       <w:r>
-        <w:rPr>
-          <w:rFonts w:ascii="Arial" w:cs="Arial" w:eastAsia="Arial" w:hAnsi="Arial"/>
-          <w:sz w:val="22"/>
-          <w:szCs w:val="22"/>
-          <w:rtl w:val="0"/>
-        </w:rPr>
-        <w:t xml:space="preserve">The research team will conduct a deeper analysis of these findings in the coming weeks in coordination with the </w:t>
-      </w:r>
-      <w:r>
+        <w:t>Further analysis should be undertaken with the principal investigators once the monitoring data can better distinguish assignment, implementation, timing, and model fidelity.</w:t>
+      </w:r>
+    </w:p>
+    <w:p>
+      <w:pPr>
+        <w:spacing w:after="240" w:before="240" w:lineRule="auto"/>
         <w:rPr>
           <w:rFonts w:ascii="Arial" w:cs="Arial" w:eastAsia="Arial" w:hAnsi="Arial"/>
           <w:b w:val="1"/>
           <w:bCs w:val="1"/>
           <w:sz w:val="22"/>
           <w:szCs w:val="22"/>
-          <w:rtl w:val="0"/>
-        </w:rPr>
-        <w:t xml:space="preserve">Principal Investigators</w:t>
-      </w:r>
-      <w:r>
-        <w:rPr>
-          <w:rFonts w:ascii="Arial" w:cs="Arial" w:eastAsia="Arial" w:hAnsi="Arial"/>
-          <w:sz w:val="22"/>
-          <w:szCs w:val="22"/>
-          <w:rtl w:val="0"/>
-        </w:rPr>
-        <w:t xml:space="preserve">.</w:t>
-      </w:r>
-    </w:p>
-    <w:p>
-      <w:pPr>
-        <w:spacing w:after="240" w:before="240" w:lineRule="auto"/>
-        <w:rPr>
-          <w:rFonts w:ascii="Arial" w:cs="Arial" w:eastAsia="Arial" w:hAnsi="Arial"/>
-          <w:b w:val="1"/>
-          <w:bCs w:val="1"/>
-          <w:sz w:val="22"/>
-          <w:szCs w:val="22"/>
-        </w:rPr>
-      </w:pPr>
-      <w:r>
-        <w:rPr>
-          <w:rFonts w:ascii="Arial" w:cs="Arial" w:eastAsia="Arial" w:hAnsi="Arial"/>
-          <w:b w:val="1"/>
-          <w:bCs w:val="1"/>
-          <w:sz w:val="22"/>
-          <w:szCs w:val="22"/>
-          <w:rtl w:val="0"/>
-        </w:rPr>
-        <w:t xml:space="preserve">Recommendations for National Rollout</w:t>
+        </w:rPr>
+      </w:pPr>
+      <w:r>
+        <w:t>Considerations for National Rollout</w:t>
       </w:r>
     </w:p>
     <w:p>
@@ -4546,29 +3587,7 @@
         </w:rPr>
       </w:pPr>
       <w:r>
-        <w:rPr>
-          <w:rFonts w:ascii="Arial" w:cs="Arial" w:eastAsia="Arial" w:hAnsi="Arial"/>
-          <w:b w:val="1"/>
-          <w:bCs w:val="1"/>
-          <w:sz w:val="22"/>
-          <w:szCs w:val="22"/>
-          <w:rtl w:val="0"/>
-        </w:rPr>
-        <w:t xml:space="preserve">Conduct regular coordination across all governance levels: </w:t>
-      </w:r>
-      <w:r>
-        <w:rPr>
-          <w:rFonts w:ascii="Arial" w:cs="Arial" w:eastAsia="Arial" w:hAnsi="Arial"/>
-          <w:sz w:val="22"/>
-          <w:szCs w:val="22"/>
-          <w:rtl w:val="0"/>
-        </w:rPr>
-        <w:t xml:space="preserve">Schedule regular calls at central office levels and at field levels to check implementation progress. Flag any implementation issues as soon as possible for the research team to provide a resolution. </w:t>
-      </w:r>
-      <w:r>
-        <w:rPr>
-          <w:rtl w:val="0"/>
-        </w:rPr>
+        <w:t>Strengthen coordination across governance levels. Regular central office and field-level check-ins would help identify implementation bottlenecks early and give the research team clearer information on emerging risks.</w:t>
       </w:r>
     </w:p>
     <w:p>
@@ -4586,24 +3605,7 @@
         </w:rPr>
       </w:pPr>
       <w:r>
-        <w:rPr>
-          <w:rFonts w:ascii="Arial" w:cs="Arial" w:eastAsia="Arial" w:hAnsi="Arial"/>
-          <w:b w:val="1"/>
-          <w:bCs w:val="1"/>
-          <w:sz w:val="22"/>
-          <w:szCs w:val="22"/>
-          <w:rtl w:val="0"/>
-        </w:rPr>
-        <w:t xml:space="preserve">Consider internal procurement timelines: </w:t>
-      </w:r>
-      <w:r>
-        <w:rPr>
-          <w:rFonts w:ascii="Arial" w:cs="Arial" w:eastAsia="Arial" w:hAnsi="Arial"/>
-          <w:sz w:val="22"/>
-          <w:szCs w:val="22"/>
-          <w:rtl w:val="0"/>
-        </w:rPr>
-        <w:t xml:space="preserve">DepEd should ensure all program materials are ready prior to national rollout, including modules available for printing throughout the school year.</w:t>
+        <w:t>Account for procurement and materials timelines. Program materials should be available before rollout, including modules that can be printed or distributed throughout the school year.</w:t>
       </w:r>
     </w:p>
     <w:p>
@@ -4621,40 +3623,7 @@
         </w:rPr>
       </w:pPr>
       <w:r>
-        <w:rPr>
-          <w:rFonts w:ascii="Arial" w:cs="Arial" w:eastAsia="Arial" w:hAnsi="Arial"/>
-          <w:b w:val="1"/>
-          <w:bCs w:val="1"/>
-          <w:sz w:val="22"/>
-          <w:szCs w:val="22"/>
-          <w:rtl w:val="0"/>
-        </w:rPr>
-        <w:t xml:space="preserve">Test monitoring tools to ensure it captures program fidelity checks: </w:t>
-      </w:r>
-      <w:r>
-        <w:rPr>
-          <w:rFonts w:ascii="Arial" w:cs="Arial" w:eastAsia="Arial" w:hAnsi="Arial"/>
-          <w:sz w:val="22"/>
-          <w:szCs w:val="22"/>
-          <w:rtl w:val="0"/>
-        </w:rPr>
-        <w:t xml:space="preserve">Monitoring systems should be expanded to capture the specific DLP model each teacher is implementing, alongside implementation timing and fidelity.</w:t>
-      </w:r>
-      <w:r>
-        <w:rPr>
-          <w:rFonts w:ascii="Arial" w:cs="Arial" w:eastAsia="Arial" w:hAnsi="Arial"/>
-          <w:b w:val="1"/>
-          <w:bCs w:val="1"/>
-          <w:sz w:val="22"/>
-          <w:szCs w:val="22"/>
-          <w:rtl w:val="0"/>
-        </w:rPr>
-        <w:t xml:space="preserve"> Real-time monitoring is strongly recommended.</w:t>
-      </w:r>
-      <w:r>
-        <w:rPr>
-          <w:rtl w:val="0"/>
-        </w:rPr>
+        <w:t>Improve monitoring tools for implementation fidelity. Monitoring systems should capture the DLP model used, timing of implementation, and basic fidelity indicators. Real-time monitoring would make the descriptive evidence more useful for program management.</w:t>
       </w:r>
     </w:p>
     <w:sectPr>

</xml_diff>